<commit_message>
Retira el conjunto Regents y reduce el proyecto a nueve conjuntos
El conjunto de examenes Regents intervenia unicamente en la prueba de
persistencia educativa, como punto intermedio entre el SAT de 2012 y la
graduacion de 2023, y era ademas el que discrepaba del ordenamiento de
las otras dos mediciones.

La prueba resulta mas concluyente sin el: el SAT de 2012 y la graduacion
de la clase de 2023 producen un ordenamiento identico entre distritos
pese a mediar once anos y a ser mediciones de naturaleza distinta, lo que
sostiene que el rezago educativo es estructural y no coyuntural.

El proyecto queda con nueve conjuntos: cinco del enunciado, dos
incorporados por atributos y cobertura (Crashes y Arrests Historic) y dos
por alineacion temporal (ACS PUMS 2023 y graduacion por cohorte).

Se corrige asimismo una inconsistencia del documento, que declaraba nueve
conjuntos en el texto mientras la tabla enumeraba diez.
</commit_message>
<xml_diff>
--- a/Entrega 1 - Entendimiento del negocio y de los datos.docx
+++ b/Entrega 1 - Entendimiento del negocio y de los datos.docx
@@ -1873,93 +1873,6 @@
                 <w:sz w:val="17"/>
               </w:rPr>
               <w:t>2016–2023</w:t>
-            </w:r>
-          </w:p>
-        </w:tc>
-      </w:tr>
-      <w:tr>
-        <w:tc>
-          <w:tcPr>
-            <w:tcW w:type="dxa" w:w="1327"/>
-          </w:tcPr>
-          <w:p>
-            <w:pPr>
-              <w:jc w:val="left"/>
-            </w:pPr>
-            <w:r/>
-            <w:r>
-              <w:rPr>
-                <w:sz w:val="17"/>
-              </w:rPr>
-              <w:t>Equipo</w:t>
-            </w:r>
-          </w:p>
-        </w:tc>
-        <w:tc>
-          <w:tcPr>
-            <w:tcW w:type="dxa" w:w="3650"/>
-          </w:tcPr>
-          <w:p>
-            <w:pPr>
-              <w:jc w:val="center"/>
-            </w:pPr>
-            <w:r/>
-            <w:r>
-              <w:rPr>
-                <w:sz w:val="17"/>
-              </w:rPr>
-              <w:t>NYC Regents Exam Results</w:t>
-            </w:r>
-          </w:p>
-        </w:tc>
-        <w:tc>
-          <w:tcPr>
-            <w:tcW w:type="dxa" w:w="1438"/>
-          </w:tcPr>
-          <w:p>
-            <w:pPr>
-              <w:jc w:val="center"/>
-            </w:pPr>
-            <w:r/>
-            <w:r>
-              <w:rPr>
-                <w:sz w:val="17"/>
-              </w:rPr>
-              <w:t>82.964</w:t>
-            </w:r>
-          </w:p>
-        </w:tc>
-        <w:tc>
-          <w:tcPr>
-            <w:tcW w:type="dxa" w:w="885"/>
-          </w:tcPr>
-          <w:p>
-            <w:pPr>
-              <w:jc w:val="center"/>
-            </w:pPr>
-            <w:r/>
-            <w:r>
-              <w:rPr>
-                <w:sz w:val="17"/>
-              </w:rPr>
-              <w:t>18</w:t>
-            </w:r>
-          </w:p>
-        </w:tc>
-        <w:tc>
-          <w:tcPr>
-            <w:tcW w:type="dxa" w:w="1770"/>
-          </w:tcPr>
-          <w:p>
-            <w:pPr>
-              <w:jc w:val="center"/>
-            </w:pPr>
-            <w:r/>
-            <w:r>
-              <w:rPr>
-                <w:sz w:val="17"/>
-              </w:rPr>
-              <w:t>2015–2019</w:t>
             </w:r>
           </w:p>
         </w:tc>
@@ -2469,27 +2382,6 @@
     </w:p>
     <w:p>
       <w:pPr>
-        <w:spacing w:after="60"/>
-      </w:pPr>
-      <w:r>
-        <w:rPr>
-          <w:sz w:val="19"/>
-        </w:rPr>
-        <w:t xml:space="preserve">• NYC Regents Exam Results 2014-15 a 2018-19: </w:t>
-      </w:r>
-      <w:hyperlink r:id="rId19">
-        <w:r>
-          <w:rPr>
-            <w:color w:val="0563C1"/>
-            <w:u w:val="single"/>
-            <w:sz w:val="17"/>
-          </w:rPr>
-          <w:t>https://data.cityofnewyork.us/Education/2014-15-2018-19-NYC-Regents-Exam-Public/2h3w-9uj9/about_data</w:t>
-        </w:r>
-      </w:hyperlink>
-    </w:p>
-    <w:p>
-      <w:pPr>
         <w:pStyle w:val="Heading1"/>
         <w:keepNext/>
         <w:spacing w:before="360"/>
@@ -4663,93 +4555,6 @@
               <w:rPr>
                 <w:sz w:val="17"/>
               </w:rPr>
-              <w:t>Regents</w:t>
-            </w:r>
-          </w:p>
-        </w:tc>
-        <w:tc>
-          <w:tcPr>
-            <w:tcW w:type="dxa" w:w="1361"/>
-          </w:tcPr>
-          <w:p>
-            <w:pPr>
-              <w:jc w:val="center"/>
-            </w:pPr>
-            <w:r/>
-            <w:r>
-              <w:rPr>
-                <w:sz w:val="17"/>
-              </w:rPr>
-              <w:t>82.964</w:t>
-            </w:r>
-          </w:p>
-        </w:tc>
-        <w:tc>
-          <w:tcPr>
-            <w:tcW w:type="dxa" w:w="907"/>
-          </w:tcPr>
-          <w:p>
-            <w:pPr>
-              <w:jc w:val="center"/>
-            </w:pPr>
-            <w:r/>
-            <w:r>
-              <w:rPr>
-                <w:sz w:val="17"/>
-              </w:rPr>
-              <w:t>18</w:t>
-            </w:r>
-          </w:p>
-        </w:tc>
-        <w:tc>
-          <w:tcPr>
-            <w:tcW w:type="dxa" w:w="2608"/>
-          </w:tcPr>
-          <w:p>
-            <w:pPr>
-              <w:jc w:val="center"/>
-            </w:pPr>
-            <w:r/>
-            <w:r>
-              <w:rPr>
-                <w:sz w:val="17"/>
-              </w:rPr>
-              <w:t>2014-15 – 2018-19</w:t>
-            </w:r>
-          </w:p>
-        </w:tc>
-        <w:tc>
-          <w:tcPr>
-            <w:tcW w:type="dxa" w:w="1814"/>
-          </w:tcPr>
-          <w:p>
-            <w:pPr>
-              <w:jc w:val="center"/>
-            </w:pPr>
-            <w:r/>
-            <w:r>
-              <w:rPr>
-                <w:sz w:val="17"/>
-              </w:rPr>
-              <w:t>Institución-examen</w:t>
-            </w:r>
-          </w:p>
-        </w:tc>
-      </w:tr>
-      <w:tr>
-        <w:tc>
-          <w:tcPr>
-            <w:tcW w:type="dxa" w:w="2381"/>
-          </w:tcPr>
-          <w:p>
-            <w:pPr>
-              <w:jc w:val="left"/>
-            </w:pPr>
-            <w:r/>
-            <w:r>
-              <w:rPr>
-                <w:sz w:val="17"/>
-              </w:rPr>
               <w:t>Resultados SAT</w:t>
             </w:r>
           </w:p>
@@ -7835,7 +7640,7 @@
         <w:keepNext/>
       </w:pPr>
       <w:r>
-        <w:t>3.4.5 Educación: graduación, Regents y SAT</w:t>
+        <w:t>3.4.5 Educación: graduación y SAT</w:t>
       </w:r>
     </w:p>
     <w:tbl>
@@ -8242,7 +8047,7 @@
               <w:rPr>
                 <w:sz w:val="17"/>
               </w:rPr>
-              <w:t>School DBN (Regents y SAT)</w:t>
+              <w:t>School DBN (SAT)</w:t>
             </w:r>
           </w:p>
         </w:tc>
@@ -8277,112 +8082,6 @@
                 <w:sz w:val="17"/>
               </w:rPr>
               <w:t>Código de institución; el tercer carácter da el distrito</w:t>
-            </w:r>
-          </w:p>
-        </w:tc>
-      </w:tr>
-      <w:tr>
-        <w:tc>
-          <w:tcPr>
-            <w:tcW w:type="dxa" w:w="2494"/>
-          </w:tcPr>
-          <w:p>
-            <w:pPr>
-              <w:jc w:val="left"/>
-            </w:pPr>
-            <w:r/>
-            <w:r>
-              <w:rPr>
-                <w:sz w:val="17"/>
-              </w:rPr>
-              <w:t>Mean Score (Regents)</w:t>
-            </w:r>
-          </w:p>
-        </w:tc>
-        <w:tc>
-          <w:tcPr>
-            <w:tcW w:type="dxa" w:w="1077"/>
-          </w:tcPr>
-          <w:p>
-            <w:pPr>
-              <w:jc w:val="center"/>
-            </w:pPr>
-            <w:r/>
-            <w:r>
-              <w:rPr>
-                <w:sz w:val="17"/>
-              </w:rPr>
-              <w:t>double</w:t>
-            </w:r>
-          </w:p>
-        </w:tc>
-        <w:tc>
-          <w:tcPr>
-            <w:tcW w:type="dxa" w:w="5499"/>
-          </w:tcPr>
-          <w:p>
-            <w:pPr>
-              <w:jc w:val="center"/>
-            </w:pPr>
-            <w:r/>
-            <w:r>
-              <w:rPr>
-                <w:sz w:val="17"/>
-              </w:rPr>
-              <w:t>Puntaje medio del examen; admite el marcador «s»</w:t>
-            </w:r>
-          </w:p>
-        </w:tc>
-      </w:tr>
-      <w:tr>
-        <w:tc>
-          <w:tcPr>
-            <w:tcW w:type="dxa" w:w="2494"/>
-          </w:tcPr>
-          <w:p>
-            <w:pPr>
-              <w:jc w:val="left"/>
-            </w:pPr>
-            <w:r/>
-            <w:r>
-              <w:rPr>
-                <w:sz w:val="17"/>
-              </w:rPr>
-              <w:t>Total Tested (Regents)</w:t>
-            </w:r>
-          </w:p>
-        </w:tc>
-        <w:tc>
-          <w:tcPr>
-            <w:tcW w:type="dxa" w:w="1077"/>
-          </w:tcPr>
-          <w:p>
-            <w:pPr>
-              <w:jc w:val="center"/>
-            </w:pPr>
-            <w:r/>
-            <w:r>
-              <w:rPr>
-                <w:sz w:val="17"/>
-              </w:rPr>
-              <w:t>integer</w:t>
-            </w:r>
-          </w:p>
-        </w:tc>
-        <w:tc>
-          <w:tcPr>
-            <w:tcW w:type="dxa" w:w="5499"/>
-          </w:tcPr>
-          <w:p>
-            <w:pPr>
-              <w:jc w:val="center"/>
-            </w:pPr>
-            <w:r/>
-            <w:r>
-              <w:rPr>
-                <w:sz w:val="17"/>
-              </w:rPr>
-              <w:t>Número de estudiantes evaluados</w:t>
             </w:r>
           </w:p>
         </w:tc>
@@ -8503,7 +8202,7 @@
                     <pic:cNvPicPr/>
                   </pic:nvPicPr>
                   <pic:blipFill>
-                    <a:blip r:embed="rId20"/>
+                    <a:blip r:embed="rId19"/>
                     <a:stretch>
                       <a:fillRect/>
                     </a:stretch>
@@ -8578,7 +8277,7 @@
                     <pic:cNvPicPr/>
                   </pic:nvPicPr>
                   <pic:blipFill>
-                    <a:blip r:embed="rId21"/>
+                    <a:blip r:embed="rId20"/>
                     <a:stretch>
                       <a:fillRect/>
                     </a:stretch>
@@ -9454,7 +9153,7 @@
                     <pic:cNvPicPr/>
                   </pic:nvPicPr>
                   <pic:blipFill>
-                    <a:blip r:embed="rId22"/>
+                    <a:blip r:embed="rId21"/>
                     <a:stretch>
                       <a:fillRect/>
                     </a:stretch>
@@ -9529,7 +9228,7 @@
                     <pic:cNvPicPr/>
                   </pic:nvPicPr>
                   <pic:blipFill>
-                    <a:blip r:embed="rId23"/>
+                    <a:blip r:embed="rId22"/>
                     <a:stretch>
                       <a:fillRect/>
                     </a:stretch>
@@ -10162,7 +9861,7 @@
                     <pic:cNvPicPr/>
                   </pic:nvPicPr>
                   <pic:blipFill>
-                    <a:blip r:embed="rId24"/>
+                    <a:blip r:embed="rId23"/>
                     <a:stretch>
                       <a:fillRect/>
                     </a:stretch>
@@ -10237,7 +9936,7 @@
                     <pic:cNvPicPr/>
                   </pic:nvPicPr>
                   <pic:blipFill>
-                    <a:blip r:embed="rId25"/>
+                    <a:blip r:embed="rId24"/>
                     <a:stretch>
                       <a:fillRect/>
                     </a:stretch>
@@ -10312,7 +10011,7 @@
                     <pic:cNvPicPr/>
                   </pic:nvPicPr>
                   <pic:blipFill>
-                    <a:blip r:embed="rId26"/>
+                    <a:blip r:embed="rId25"/>
                     <a:stretch>
                       <a:fillRect/>
                     </a:stretch>
@@ -10387,7 +10086,7 @@
                     <pic:cNvPicPr/>
                   </pic:nvPicPr>
                   <pic:blipFill>
-                    <a:blip r:embed="rId27"/>
+                    <a:blip r:embed="rId26"/>
                     <a:stretch>
                       <a:fillRect/>
                     </a:stretch>
@@ -11125,7 +10824,7 @@
                     <pic:cNvPicPr/>
                   </pic:nvPicPr>
                   <pic:blipFill>
-                    <a:blip r:embed="rId28"/>
+                    <a:blip r:embed="rId27"/>
                     <a:stretch>
                       <a:fillRect/>
                     </a:stretch>
@@ -11210,7 +10909,7 @@
                     <pic:cNvPicPr/>
                   </pic:nvPicPr>
                   <pic:blipFill>
-                    <a:blip r:embed="rId29"/>
+                    <a:blip r:embed="rId28"/>
                     <a:stretch>
                       <a:fillRect/>
                     </a:stretch>
@@ -11940,7 +11639,7 @@
                     <pic:cNvPicPr/>
                   </pic:nvPicPr>
                   <pic:blipFill>
-                    <a:blip r:embed="rId30"/>
+                    <a:blip r:embed="rId29"/>
                     <a:stretch>
                       <a:fillRect/>
                     </a:stretch>
@@ -12583,7 +12282,7 @@
                     <pic:cNvPicPr/>
                   </pic:nvPicPr>
                   <pic:blipFill>
-                    <a:blip r:embed="rId31"/>
+                    <a:blip r:embed="rId30"/>
                     <a:stretch>
                       <a:fillRect/>
                     </a:stretch>
@@ -13095,7 +12794,7 @@
           <w:i w:val="0"/>
           <w:sz w:val="22"/>
         </w:rPr>
-        <w:t>Cabe preguntarse si recurrir a un único año introduce arbitrariedad. Se contrastan para ello tres mediciones distintas separadas por once años: el puntaje SAT de 2012 que figura en el enunciado, el puntaje medio de los exámenes Regents de 2019 y la tasa de graduación de la clase de 2023.</w:t>
+        <w:t>Cabe preguntarse si recurrir a un único año introduce arbitrariedad. Se contrastan para ello tres mediciones distintas separadas por once años: el puntaje SAT de 2012 que figura en el enunciado y la tasa de graduación de la clase de 2023.</w:t>
       </w:r>
     </w:p>
     <w:tbl>
@@ -13107,17 +12806,53 @@
         <w:tblLook w:firstColumn="1" w:firstRow="1" w:lastColumn="0" w:lastRow="0" w:noHBand="0" w:noVBand="1" w:val="04A0"/>
       </w:tblPr>
       <w:tblGrid>
-        <w:gridCol w:w="1344"/>
-        <w:gridCol w:w="1344"/>
-        <w:gridCol w:w="1344"/>
-        <w:gridCol w:w="1344"/>
-        <w:gridCol w:w="1344"/>
-        <w:gridCol w:w="1344"/>
-        <w:gridCol w:w="1344"/>
+        <w:gridCol w:w="1881"/>
+        <w:gridCol w:w="1881"/>
+        <w:gridCol w:w="1881"/>
+        <w:gridCol w:w="1881"/>
+        <w:gridCol w:w="1881"/>
       </w:tblGrid>
       <w:tr>
         <w:tc>
           <w:tcPr>
+            <w:tcW w:type="dxa" w:w="1814"/>
+            <w:shd w:fill="DCE6F1"/>
+          </w:tcPr>
+          <w:p>
+            <w:pPr>
+              <w:jc w:val="center"/>
+            </w:pPr>
+            <w:r/>
+            <w:r>
+              <w:rPr>
+                <w:b/>
+                <w:sz w:val="17"/>
+              </w:rPr>
+              <w:t>Distrito</w:t>
+            </w:r>
+          </w:p>
+        </w:tc>
+        <w:tc>
+          <w:tcPr>
+            <w:tcW w:type="dxa" w:w="1474"/>
+            <w:shd w:fill="DCE6F1"/>
+          </w:tcPr>
+          <w:p>
+            <w:pPr>
+              <w:jc w:val="center"/>
+            </w:pPr>
+            <w:r/>
+            <w:r>
+              <w:rPr>
+                <w:b/>
+                <w:sz w:val="17"/>
+              </w:rPr>
+              <w:t>SAT 2012</w:t>
+            </w:r>
+          </w:p>
+        </w:tc>
+        <w:tc>
+          <w:tcPr>
             <w:tcW w:type="dxa" w:w="1701"/>
             <w:shd w:fill="DCE6F1"/>
           </w:tcPr>
@@ -13131,13 +12866,13 @@
                 <w:b/>
                 <w:sz w:val="17"/>
               </w:rPr>
-              <w:t>Distrito</w:t>
-            </w:r>
-          </w:p>
-        </w:tc>
-        <w:tc>
-          <w:tcPr>
-            <w:tcW w:type="dxa" w:w="1247"/>
+              <w:t>Graduación 2023</w:t>
+            </w:r>
+          </w:p>
+        </w:tc>
+        <w:tc>
+          <w:tcPr>
+            <w:tcW w:type="dxa" w:w="1928"/>
             <w:shd w:fill="DCE6F1"/>
           </w:tcPr>
           <w:p>
@@ -13150,13 +12885,13 @@
                 <w:b/>
                 <w:sz w:val="17"/>
               </w:rPr>
-              <w:t>SAT 2012</w:t>
-            </w:r>
-          </w:p>
-        </w:tc>
-        <w:tc>
-          <w:tcPr>
-            <w:tcW w:type="dxa" w:w="1247"/>
+              <w:t>Puesto SAT 2012</w:t>
+            </w:r>
+          </w:p>
+        </w:tc>
+        <w:tc>
+          <w:tcPr>
+            <w:tcW w:type="dxa" w:w="2154"/>
             <w:shd w:fill="DCE6F1"/>
           </w:tcPr>
           <w:p>
@@ -13169,83 +12904,7 @@
                 <w:b/>
                 <w:sz w:val="17"/>
               </w:rPr>
-              <w:t>Regents 2019</w:t>
-            </w:r>
-          </w:p>
-        </w:tc>
-        <w:tc>
-          <w:tcPr>
-            <w:tcW w:type="dxa" w:w="1361"/>
-            <w:shd w:fill="DCE6F1"/>
-          </w:tcPr>
-          <w:p>
-            <w:pPr>
-              <w:jc w:val="center"/>
-            </w:pPr>
-            <w:r/>
-            <w:r>
-              <w:rPr>
-                <w:b/>
-                <w:sz w:val="17"/>
-              </w:rPr>
-              <w:t>Graduación 2023</w:t>
-            </w:r>
-          </w:p>
-        </w:tc>
-        <w:tc>
-          <w:tcPr>
-            <w:tcW w:type="dxa" w:w="1134"/>
-            <w:shd w:fill="DCE6F1"/>
-          </w:tcPr>
-          <w:p>
-            <w:pPr>
-              <w:jc w:val="center"/>
-            </w:pPr>
-            <w:r/>
-            <w:r>
-              <w:rPr>
-                <w:b/>
-                <w:sz w:val="17"/>
-              </w:rPr>
-              <w:t>Puesto SAT</w:t>
-            </w:r>
-          </w:p>
-        </w:tc>
-        <w:tc>
-          <w:tcPr>
-            <w:tcW w:type="dxa" w:w="1134"/>
-            <w:shd w:fill="DCE6F1"/>
-          </w:tcPr>
-          <w:p>
-            <w:pPr>
-              <w:jc w:val="center"/>
-            </w:pPr>
-            <w:r/>
-            <w:r>
-              <w:rPr>
-                <w:b/>
-                <w:sz w:val="17"/>
-              </w:rPr>
-              <w:t>Puesto Reg.</w:t>
-            </w:r>
-          </w:p>
-        </w:tc>
-        <w:tc>
-          <w:tcPr>
-            <w:tcW w:type="dxa" w:w="1247"/>
-            <w:shd w:fill="DCE6F1"/>
-          </w:tcPr>
-          <w:p>
-            <w:pPr>
-              <w:jc w:val="center"/>
-            </w:pPr>
-            <w:r/>
-            <w:r>
-              <w:rPr>
-                <w:b/>
-                <w:sz w:val="17"/>
-              </w:rPr>
-              <w:t>Puesto grad.</w:t>
+              <w:t>Puesto graduación 2023</w:t>
             </w:r>
           </w:p>
         </w:tc>
@@ -13253,61 +12912,44 @@
       <w:tr>
         <w:tc>
           <w:tcPr>
+            <w:tcW w:type="dxa" w:w="1814"/>
+          </w:tcPr>
+          <w:p>
+            <w:pPr>
+              <w:jc w:val="left"/>
+            </w:pPr>
+            <w:r/>
+            <w:r>
+              <w:rPr>
+                <w:sz w:val="17"/>
+              </w:rPr>
+              <w:t>Bronx</w:t>
+            </w:r>
+          </w:p>
+        </w:tc>
+        <w:tc>
+          <w:tcPr>
+            <w:tcW w:type="dxa" w:w="1474"/>
+          </w:tcPr>
+          <w:p>
+            <w:pPr>
+              <w:jc w:val="center"/>
+            </w:pPr>
+            <w:r/>
+            <w:r>
+              <w:rPr>
+                <w:sz w:val="17"/>
+              </w:rPr>
+              <w:t>1.144,6</w:t>
+            </w:r>
+          </w:p>
+        </w:tc>
+        <w:tc>
+          <w:tcPr>
             <w:tcW w:type="dxa" w:w="1701"/>
           </w:tcPr>
           <w:p>
             <w:pPr>
-              <w:jc w:val="left"/>
-            </w:pPr>
-            <w:r/>
-            <w:r>
-              <w:rPr>
-                <w:sz w:val="17"/>
-              </w:rPr>
-              <w:t>Bronx</w:t>
-            </w:r>
-          </w:p>
-        </w:tc>
-        <w:tc>
-          <w:tcPr>
-            <w:tcW w:type="dxa" w:w="1247"/>
-          </w:tcPr>
-          <w:p>
-            <w:pPr>
-              <w:jc w:val="center"/>
-            </w:pPr>
-            <w:r/>
-            <w:r>
-              <w:rPr>
-                <w:sz w:val="17"/>
-              </w:rPr>
-              <w:t>1.144,6</w:t>
-            </w:r>
-          </w:p>
-        </w:tc>
-        <w:tc>
-          <w:tcPr>
-            <w:tcW w:type="dxa" w:w="1247"/>
-          </w:tcPr>
-          <w:p>
-            <w:pPr>
-              <w:jc w:val="center"/>
-            </w:pPr>
-            <w:r/>
-            <w:r>
-              <w:rPr>
-                <w:sz w:val="17"/>
-              </w:rPr>
-              <w:t>66,8</w:t>
-            </w:r>
-          </w:p>
-        </w:tc>
-        <w:tc>
-          <w:tcPr>
-            <w:tcW w:type="dxa" w:w="1361"/>
-          </w:tcPr>
-          <w:p>
-            <w:pPr>
               <w:jc w:val="center"/>
             </w:pPr>
             <w:r/>
@@ -13321,7 +12963,7 @@
         </w:tc>
         <w:tc>
           <w:tcPr>
-            <w:tcW w:type="dxa" w:w="1134"/>
+            <w:tcW w:type="dxa" w:w="1928"/>
           </w:tcPr>
           <w:p>
             <w:pPr>
@@ -13338,24 +12980,7 @@
         </w:tc>
         <w:tc>
           <w:tcPr>
-            <w:tcW w:type="dxa" w:w="1134"/>
-          </w:tcPr>
-          <w:p>
-            <w:pPr>
-              <w:jc w:val="center"/>
-            </w:pPr>
-            <w:r/>
-            <w:r>
-              <w:rPr>
-                <w:sz w:val="17"/>
-              </w:rPr>
-              <w:t>1</w:t>
-            </w:r>
-          </w:p>
-        </w:tc>
-        <w:tc>
-          <w:tcPr>
-            <w:tcW w:type="dxa" w:w="1247"/>
+            <w:tcW w:type="dxa" w:w="2154"/>
           </w:tcPr>
           <w:p>
             <w:pPr>
@@ -13374,61 +12999,44 @@
       <w:tr>
         <w:tc>
           <w:tcPr>
+            <w:tcW w:type="dxa" w:w="1814"/>
+          </w:tcPr>
+          <w:p>
+            <w:pPr>
+              <w:jc w:val="left"/>
+            </w:pPr>
+            <w:r/>
+            <w:r>
+              <w:rPr>
+                <w:sz w:val="17"/>
+              </w:rPr>
+              <w:t>Brooklyn</w:t>
+            </w:r>
+          </w:p>
+        </w:tc>
+        <w:tc>
+          <w:tcPr>
+            <w:tcW w:type="dxa" w:w="1474"/>
+          </w:tcPr>
+          <w:p>
+            <w:pPr>
+              <w:jc w:val="center"/>
+            </w:pPr>
+            <w:r/>
+            <w:r>
+              <w:rPr>
+                <w:sz w:val="17"/>
+              </w:rPr>
+              <w:t>1.167,4</w:t>
+            </w:r>
+          </w:p>
+        </w:tc>
+        <w:tc>
+          <w:tcPr>
             <w:tcW w:type="dxa" w:w="1701"/>
           </w:tcPr>
           <w:p>
             <w:pPr>
-              <w:jc w:val="left"/>
-            </w:pPr>
-            <w:r/>
-            <w:r>
-              <w:rPr>
-                <w:sz w:val="17"/>
-              </w:rPr>
-              <w:t>Brooklyn</w:t>
-            </w:r>
-          </w:p>
-        </w:tc>
-        <w:tc>
-          <w:tcPr>
-            <w:tcW w:type="dxa" w:w="1247"/>
-          </w:tcPr>
-          <w:p>
-            <w:pPr>
-              <w:jc w:val="center"/>
-            </w:pPr>
-            <w:r/>
-            <w:r>
-              <w:rPr>
-                <w:sz w:val="17"/>
-              </w:rPr>
-              <w:t>1.167,4</w:t>
-            </w:r>
-          </w:p>
-        </w:tc>
-        <w:tc>
-          <w:tcPr>
-            <w:tcW w:type="dxa" w:w="1247"/>
-          </w:tcPr>
-          <w:p>
-            <w:pPr>
-              <w:jc w:val="center"/>
-            </w:pPr>
-            <w:r/>
-            <w:r>
-              <w:rPr>
-                <w:sz w:val="17"/>
-              </w:rPr>
-              <w:t>70,3</w:t>
-            </w:r>
-          </w:p>
-        </w:tc>
-        <w:tc>
-          <w:tcPr>
-            <w:tcW w:type="dxa" w:w="1361"/>
-          </w:tcPr>
-          <w:p>
-            <w:pPr>
               <w:jc w:val="center"/>
             </w:pPr>
             <w:r/>
@@ -13442,7 +13050,7 @@
         </w:tc>
         <w:tc>
           <w:tcPr>
-            <w:tcW w:type="dxa" w:w="1134"/>
+            <w:tcW w:type="dxa" w:w="1928"/>
           </w:tcPr>
           <w:p>
             <w:pPr>
@@ -13459,24 +13067,7 @@
         </w:tc>
         <w:tc>
           <w:tcPr>
-            <w:tcW w:type="dxa" w:w="1134"/>
-          </w:tcPr>
-          <w:p>
-            <w:pPr>
-              <w:jc w:val="center"/>
-            </w:pPr>
-            <w:r/>
-            <w:r>
-              <w:rPr>
-                <w:sz w:val="17"/>
-              </w:rPr>
-              <w:t>2</w:t>
-            </w:r>
-          </w:p>
-        </w:tc>
-        <w:tc>
-          <w:tcPr>
-            <w:tcW w:type="dxa" w:w="1247"/>
+            <w:tcW w:type="dxa" w:w="2154"/>
           </w:tcPr>
           <w:p>
             <w:pPr>
@@ -13495,61 +13086,44 @@
       <w:tr>
         <w:tc>
           <w:tcPr>
+            <w:tcW w:type="dxa" w:w="1814"/>
+          </w:tcPr>
+          <w:p>
+            <w:pPr>
+              <w:jc w:val="left"/>
+            </w:pPr>
+            <w:r/>
+            <w:r>
+              <w:rPr>
+                <w:sz w:val="17"/>
+              </w:rPr>
+              <w:t>Manhattan</w:t>
+            </w:r>
+          </w:p>
+        </w:tc>
+        <w:tc>
+          <w:tcPr>
+            <w:tcW w:type="dxa" w:w="1474"/>
+          </w:tcPr>
+          <w:p>
+            <w:pPr>
+              <w:jc w:val="center"/>
+            </w:pPr>
+            <w:r/>
+            <w:r>
+              <w:rPr>
+                <w:sz w:val="17"/>
+              </w:rPr>
+              <w:t>1.260,2</w:t>
+            </w:r>
+          </w:p>
+        </w:tc>
+        <w:tc>
+          <w:tcPr>
             <w:tcW w:type="dxa" w:w="1701"/>
           </w:tcPr>
           <w:p>
             <w:pPr>
-              <w:jc w:val="left"/>
-            </w:pPr>
-            <w:r/>
-            <w:r>
-              <w:rPr>
-                <w:sz w:val="17"/>
-              </w:rPr>
-              <w:t>Manhattan</w:t>
-            </w:r>
-          </w:p>
-        </w:tc>
-        <w:tc>
-          <w:tcPr>
-            <w:tcW w:type="dxa" w:w="1247"/>
-          </w:tcPr>
-          <w:p>
-            <w:pPr>
-              <w:jc w:val="center"/>
-            </w:pPr>
-            <w:r/>
-            <w:r>
-              <w:rPr>
-                <w:sz w:val="17"/>
-              </w:rPr>
-              <w:t>1.260,2</w:t>
-            </w:r>
-          </w:p>
-        </w:tc>
-        <w:tc>
-          <w:tcPr>
-            <w:tcW w:type="dxa" w:w="1247"/>
-          </w:tcPr>
-          <w:p>
-            <w:pPr>
-              <w:jc w:val="center"/>
-            </w:pPr>
-            <w:r/>
-            <w:r>
-              <w:rPr>
-                <w:sz w:val="17"/>
-              </w:rPr>
-              <w:t>72,7</w:t>
-            </w:r>
-          </w:p>
-        </w:tc>
-        <w:tc>
-          <w:tcPr>
-            <w:tcW w:type="dxa" w:w="1361"/>
-          </w:tcPr>
-          <w:p>
-            <w:pPr>
               <w:jc w:val="center"/>
             </w:pPr>
             <w:r/>
@@ -13563,7 +13137,7 @@
         </w:tc>
         <w:tc>
           <w:tcPr>
-            <w:tcW w:type="dxa" w:w="1134"/>
+            <w:tcW w:type="dxa" w:w="1928"/>
           </w:tcPr>
           <w:p>
             <w:pPr>
@@ -13580,24 +13154,7 @@
         </w:tc>
         <w:tc>
           <w:tcPr>
-            <w:tcW w:type="dxa" w:w="1134"/>
-          </w:tcPr>
-          <w:p>
-            <w:pPr>
-              <w:jc w:val="center"/>
-            </w:pPr>
-            <w:r/>
-            <w:r>
-              <w:rPr>
-                <w:sz w:val="17"/>
-              </w:rPr>
-              <w:t>5</w:t>
-            </w:r>
-          </w:p>
-        </w:tc>
-        <w:tc>
-          <w:tcPr>
-            <w:tcW w:type="dxa" w:w="1247"/>
+            <w:tcW w:type="dxa" w:w="2154"/>
           </w:tcPr>
           <w:p>
             <w:pPr>
@@ -13616,61 +13173,44 @@
       <w:tr>
         <w:tc>
           <w:tcPr>
+            <w:tcW w:type="dxa" w:w="1814"/>
+          </w:tcPr>
+          <w:p>
+            <w:pPr>
+              <w:jc w:val="left"/>
+            </w:pPr>
+            <w:r/>
+            <w:r>
+              <w:rPr>
+                <w:sz w:val="17"/>
+              </w:rPr>
+              <w:t>Queens</w:t>
+            </w:r>
+          </w:p>
+        </w:tc>
+        <w:tc>
+          <w:tcPr>
+            <w:tcW w:type="dxa" w:w="1474"/>
+          </w:tcPr>
+          <w:p>
+            <w:pPr>
+              <w:jc w:val="center"/>
+            </w:pPr>
+            <w:r/>
+            <w:r>
+              <w:rPr>
+                <w:sz w:val="17"/>
+              </w:rPr>
+              <w:t>1.275,4</w:t>
+            </w:r>
+          </w:p>
+        </w:tc>
+        <w:tc>
+          <w:tcPr>
             <w:tcW w:type="dxa" w:w="1701"/>
           </w:tcPr>
           <w:p>
             <w:pPr>
-              <w:jc w:val="left"/>
-            </w:pPr>
-            <w:r/>
-            <w:r>
-              <w:rPr>
-                <w:sz w:val="17"/>
-              </w:rPr>
-              <w:t>Queens</w:t>
-            </w:r>
-          </w:p>
-        </w:tc>
-        <w:tc>
-          <w:tcPr>
-            <w:tcW w:type="dxa" w:w="1247"/>
-          </w:tcPr>
-          <w:p>
-            <w:pPr>
-              <w:jc w:val="center"/>
-            </w:pPr>
-            <w:r/>
-            <w:r>
-              <w:rPr>
-                <w:sz w:val="17"/>
-              </w:rPr>
-              <w:t>1.275,4</w:t>
-            </w:r>
-          </w:p>
-        </w:tc>
-        <w:tc>
-          <w:tcPr>
-            <w:tcW w:type="dxa" w:w="1247"/>
-          </w:tcPr>
-          <w:p>
-            <w:pPr>
-              <w:jc w:val="center"/>
-            </w:pPr>
-            <w:r/>
-            <w:r>
-              <w:rPr>
-                <w:sz w:val="17"/>
-              </w:rPr>
-              <w:t>72,1</w:t>
-            </w:r>
-          </w:p>
-        </w:tc>
-        <w:tc>
-          <w:tcPr>
-            <w:tcW w:type="dxa" w:w="1361"/>
-          </w:tcPr>
-          <w:p>
-            <w:pPr>
               <w:jc w:val="center"/>
             </w:pPr>
             <w:r/>
@@ -13684,7 +13224,7 @@
         </w:tc>
         <w:tc>
           <w:tcPr>
-            <w:tcW w:type="dxa" w:w="1134"/>
+            <w:tcW w:type="dxa" w:w="1928"/>
           </w:tcPr>
           <w:p>
             <w:pPr>
@@ -13701,24 +13241,7 @@
         </w:tc>
         <w:tc>
           <w:tcPr>
-            <w:tcW w:type="dxa" w:w="1134"/>
-          </w:tcPr>
-          <w:p>
-            <w:pPr>
-              <w:jc w:val="center"/>
-            </w:pPr>
-            <w:r/>
-            <w:r>
-              <w:rPr>
-                <w:sz w:val="17"/>
-              </w:rPr>
-              <w:t>4</w:t>
-            </w:r>
-          </w:p>
-        </w:tc>
-        <w:tc>
-          <w:tcPr>
-            <w:tcW w:type="dxa" w:w="1247"/>
+            <w:tcW w:type="dxa" w:w="2154"/>
           </w:tcPr>
           <w:p>
             <w:pPr>
@@ -13737,61 +13260,44 @@
       <w:tr>
         <w:tc>
           <w:tcPr>
+            <w:tcW w:type="dxa" w:w="1814"/>
+          </w:tcPr>
+          <w:p>
+            <w:pPr>
+              <w:jc w:val="left"/>
+            </w:pPr>
+            <w:r/>
+            <w:r>
+              <w:rPr>
+                <w:sz w:val="17"/>
+              </w:rPr>
+              <w:t>Staten Island</w:t>
+            </w:r>
+          </w:p>
+        </w:tc>
+        <w:tc>
+          <w:tcPr>
+            <w:tcW w:type="dxa" w:w="1474"/>
+          </w:tcPr>
+          <w:p>
+            <w:pPr>
+              <w:jc w:val="center"/>
+            </w:pPr>
+            <w:r/>
+            <w:r>
+              <w:rPr>
+                <w:sz w:val="17"/>
+              </w:rPr>
+              <w:t>1.359,2</w:t>
+            </w:r>
+          </w:p>
+        </w:tc>
+        <w:tc>
+          <w:tcPr>
             <w:tcW w:type="dxa" w:w="1701"/>
           </w:tcPr>
           <w:p>
             <w:pPr>
-              <w:jc w:val="left"/>
-            </w:pPr>
-            <w:r/>
-            <w:r>
-              <w:rPr>
-                <w:sz w:val="17"/>
-              </w:rPr>
-              <w:t>Staten Island</w:t>
-            </w:r>
-          </w:p>
-        </w:tc>
-        <w:tc>
-          <w:tcPr>
-            <w:tcW w:type="dxa" w:w="1247"/>
-          </w:tcPr>
-          <w:p>
-            <w:pPr>
-              <w:jc w:val="center"/>
-            </w:pPr>
-            <w:r/>
-            <w:r>
-              <w:rPr>
-                <w:sz w:val="17"/>
-              </w:rPr>
-              <w:t>1.359,2</w:t>
-            </w:r>
-          </w:p>
-        </w:tc>
-        <w:tc>
-          <w:tcPr>
-            <w:tcW w:type="dxa" w:w="1247"/>
-          </w:tcPr>
-          <w:p>
-            <w:pPr>
-              <w:jc w:val="center"/>
-            </w:pPr>
-            <w:r/>
-            <w:r>
-              <w:rPr>
-                <w:sz w:val="17"/>
-              </w:rPr>
-              <w:t>71,9</w:t>
-            </w:r>
-          </w:p>
-        </w:tc>
-        <w:tc>
-          <w:tcPr>
-            <w:tcW w:type="dxa" w:w="1361"/>
-          </w:tcPr>
-          <w:p>
-            <w:pPr>
               <w:jc w:val="center"/>
             </w:pPr>
             <w:r/>
@@ -13805,7 +13311,7 @@
         </w:tc>
         <w:tc>
           <w:tcPr>
-            <w:tcW w:type="dxa" w:w="1134"/>
+            <w:tcW w:type="dxa" w:w="1928"/>
           </w:tcPr>
           <w:p>
             <w:pPr>
@@ -13822,24 +13328,7 @@
         </w:tc>
         <w:tc>
           <w:tcPr>
-            <w:tcW w:type="dxa" w:w="1134"/>
-          </w:tcPr>
-          <w:p>
-            <w:pPr>
-              <w:jc w:val="center"/>
-            </w:pPr>
-            <w:r/>
-            <w:r>
-              <w:rPr>
-                <w:sz w:val="17"/>
-              </w:rPr>
-              <w:t>3</w:t>
-            </w:r>
-          </w:p>
-        </w:tc>
-        <w:tc>
-          <w:tcPr>
-            <w:tcW w:type="dxa" w:w="1247"/>
+            <w:tcW w:type="dxa" w:w="2154"/>
           </w:tcPr>
           <w:p>
             <w:pPr>
@@ -13873,7 +13362,7 @@
           <w:i w:val="0"/>
           <w:sz w:val="22"/>
         </w:rPr>
-        <w:t>El resultado es parcialmente concluyente. El puntaje SAT de 2012 y la tasa de graduación de 2023 producen un ordenamiento idéntico, pese a mediar once años y tratarse de mediciones de naturaleza distinta. El examen Regents discrepa en Manhattan y Staten Island, lo que resulta atribuible a que mide la aprobación de exámenes concretos y depende de qué alumnos se presentan a cuáles.</w:t>
+        <w:t>El resultado es concluyente. Ambas mediciones producen un ordenamiento idéntico, pese a mediar once años entre ellas y a ser de naturaleza distinta: una evalúa el rendimiento en una prueba estandarizada y la otra la culminación efectiva de los estudios. El Bronx ocupa la última posición y Staten Island la primera en las dos.</w:t>
       </w:r>
     </w:p>
     <w:p>
@@ -13883,7 +13372,7 @@
           <w:i w:val="0"/>
           <w:sz w:val="22"/>
         </w:rPr>
-        <w:t>Las dos primeras posiciones desfavorables, Bronx y Brooklyn, son idénticas en las tres mediciones. Cabe concluir que la identificación del territorio educativamente más rezagado no depende del año ni del instrumento empleado, mientras que el ordenamiento entre los distritos de mejor desempeño sí es sensible a ambos factores.</w:t>
+        <w:t>Cabe concluir que la identificación del territorio educativamente más rezagado no depende del año ni del instrumento empleado: el ordenamiento constituye una característica estructural del territorio y no una fotografía coyuntural. Ello justifica que el conjunto SAT de 2012, aunque desfasado para el corte transversal, conserve valor como caracterización de fondo.</w:t>
       </w:r>
     </w:p>
     <w:p>
@@ -15209,7 +14698,7 @@
                     <pic:cNvPicPr/>
                   </pic:nvPicPr>
                   <pic:blipFill>
-                    <a:blip r:embed="rId32"/>
+                    <a:blip r:embed="rId31"/>
                     <a:stretch>
                       <a:fillRect/>
                     </a:stretch>
@@ -18150,76 +17639,6 @@
               <w:rPr>
                 <w:sz w:val="17"/>
               </w:rPr>
-              <w:t>Regents (puntaje medio)</w:t>
-            </w:r>
-          </w:p>
-        </w:tc>
-        <w:tc>
-          <w:tcPr>
-            <w:tcW w:type="dxa" w:w="2041"/>
-          </w:tcPr>
-          <w:p>
-            <w:pPr>
-              <w:jc w:val="center"/>
-            </w:pPr>
-            <w:r/>
-            <w:r>
-              <w:rPr>
-                <w:sz w:val="17"/>
-              </w:rPr>
-              <w:t>33.112</w:t>
-            </w:r>
-          </w:p>
-        </w:tc>
-        <w:tc>
-          <w:tcPr>
-            <w:tcW w:type="dxa" w:w="1814"/>
-          </w:tcPr>
-          <w:p>
-            <w:pPr>
-              <w:jc w:val="center"/>
-            </w:pPr>
-            <w:r/>
-            <w:r>
-              <w:rPr>
-                <w:sz w:val="17"/>
-              </w:rPr>
-              <w:t>82.964</w:t>
-            </w:r>
-          </w:p>
-        </w:tc>
-        <w:tc>
-          <w:tcPr>
-            <w:tcW w:type="dxa" w:w="2041"/>
-          </w:tcPr>
-          <w:p>
-            <w:pPr>
-              <w:jc w:val="center"/>
-            </w:pPr>
-            <w:r/>
-            <w:r>
-              <w:rPr>
-                <w:sz w:val="17"/>
-              </w:rPr>
-              <w:t>39,91%</w:t>
-            </w:r>
-          </w:p>
-        </w:tc>
-      </w:tr>
-      <w:tr>
-        <w:tc>
-          <w:tcPr>
-            <w:tcW w:type="dxa" w:w="3175"/>
-          </w:tcPr>
-          <w:p>
-            <w:pPr>
-              <w:jc w:val="left"/>
-            </w:pPr>
-            <w:r/>
-            <w:r>
-              <w:rPr>
-                <w:sz w:val="17"/>
-              </w:rPr>
               <w:t>Graduación (tasa)</w:t>
             </w:r>
           </w:p>
@@ -18364,7 +17783,7 @@
           <w:i w:val="0"/>
           <w:sz w:val="22"/>
         </w:rPr>
-        <w:t>El conteo de nulos sobre el conjunto SAT arrojaba cero ausencias en los seis atributos, lo que sugería una calidad perfecta. Un reporte de calidad que solo busque nulos pasaría por alto casi el 40% del conjunto de Regents.</w:t>
+        <w:t>El conteo de nulos sobre el conjunto SAT arrojaba cero ausencias en los seis atributos, lo que sugería una calidad perfecta. Un reporte de calidad que solo busque nulos pasaría por alto una cuarta parte del conjunto de graduación.</w:t>
       </w:r>
     </w:p>
     <w:p>
@@ -19056,7 +18475,7 @@
               <w:rPr>
                 <w:sz w:val="16"/>
               </w:rPr>
-              <w:t>Marcador «s» en Regents, graduación y SAT</w:t>
+              <w:t>Marcador «s» en graduación y SAT</w:t>
             </w:r>
           </w:p>
         </w:tc>
@@ -19073,7 +18492,7 @@
               <w:rPr>
                 <w:sz w:val="16"/>
               </w:rPr>
-              <w:t>hasta 39,91%</w:t>
+              <w:t>hasta 25,45%</w:t>
             </w:r>
           </w:p>
         </w:tc>
@@ -20207,7 +19626,7 @@
               <w:rPr>
                 <w:sz w:val="17"/>
               </w:rPr>
-              <w:t>Regents, graduación</w:t>
+              <w:t>Graduación</w:t>
             </w:r>
           </w:p>
         </w:tc>
@@ -20260,7 +19679,7 @@
               <w:rPr>
                 <w:sz w:val="17"/>
               </w:rPr>
-              <w:t>SAT, Regents</w:t>
+              <w:t>SAT</w:t>
             </w:r>
           </w:p>
         </w:tc>
@@ -20425,7 +19844,7 @@
         <w:rPr>
           <w:sz w:val="22"/>
         </w:rPr>
-        <w:t>Exclusión de las instituciones con puntaje suprimido en el cálculo de promedios educativos, y de aquellas sin estudiantes evaluados en el promedio ponderado de Regents.</w:t>
+        <w:t>Exclusión de las instituciones con puntaje suprimido en el cálculo de los promedios educativos, mediante una expresión regular que admite únicamente valores numéricos.</w:t>
       </w:r>
     </w:p>
     <w:p>
@@ -20689,28 +20108,6 @@
         <w:rPr>
           <w:sz w:val="19"/>
         </w:rPr>
-        <w:t xml:space="preserve">New York City Department of Education. NYC Regents Exam Results 2014-15 a 2018-19. NYC Open Data. </w:t>
-      </w:r>
-      <w:hyperlink r:id="rId19">
-        <w:r>
-          <w:rPr>
-            <w:color w:val="0563C1"/>
-            <w:u w:val="single"/>
-            <w:sz w:val="17"/>
-          </w:rPr>
-          <w:t>Disponible en línea</w:t>
-        </w:r>
-      </w:hyperlink>
-    </w:p>
-    <w:p>
-      <w:pPr>
-        <w:spacing w:after="100"/>
-        <w:ind w:left="567" w:hanging="567"/>
-      </w:pPr>
-      <w:r>
-        <w:rPr>
-          <w:sz w:val="19"/>
-        </w:rPr>
         <w:t xml:space="preserve">U.S. Census Bureau. American Community Survey 2023, Public Use Microdata Sample, New York. </w:t>
       </w:r>
       <w:hyperlink r:id="rId16">
@@ -20779,7 +20176,7 @@
         </w:rPr>
         <w:t xml:space="preserve">New York City Department of Transportation. Traffic Deaths Reach All-time Low, 2026. </w:t>
       </w:r>
-      <w:hyperlink r:id="rId33">
+      <w:hyperlink r:id="rId32">
         <w:r>
           <w:rPr>
             <w:color w:val="0563C1"/>
@@ -20801,7 +20198,7 @@
         </w:rPr>
         <w:t xml:space="preserve">New York City Department of Transportation. Vision Zero Reimagined: A New Action Plan for Road Safety, 2026. </w:t>
       </w:r>
-      <w:hyperlink r:id="rId34">
+      <w:hyperlink r:id="rId33">
         <w:r>
           <w:rPr>
             <w:color w:val="0563C1"/>
@@ -20823,7 +20220,7 @@
         </w:rPr>
         <w:t xml:space="preserve">New York City Department of City Planning. New York City's Population Estimates and Trends, julio de 2026. </w:t>
       </w:r>
-      <w:hyperlink r:id="rId35">
+      <w:hyperlink r:id="rId34">
         <w:r>
           <w:rPr>
             <w:color w:val="0563C1"/>
@@ -20845,7 +20242,7 @@
         </w:rPr>
         <w:t xml:space="preserve">Office of the New York City Comptroller. Annual State of the City's Economy and Finances 2025. </w:t>
       </w:r>
-      <w:hyperlink r:id="rId36">
+      <w:hyperlink r:id="rId35">
         <w:r>
           <w:rPr>
             <w:color w:val="0563C1"/>
@@ -20867,7 +20264,7 @@
         </w:rPr>
         <w:t xml:space="preserve">New York City Economic Development Corporation. State of the New York City Economy 2025. </w:t>
       </w:r>
-      <w:hyperlink r:id="rId37">
+      <w:hyperlink r:id="rId36">
         <w:r>
           <w:rPr>
             <w:color w:val="0563C1"/>

</xml_diff>